<commit_message>
Update the lab site with 2026 news, facilities, people, and the shared banner.
EOF

Co-authored-by: Cursor <cursoragent@cursor.com>
</commit_message>
<xml_diff>
--- a/img/news/2026/reference.docx
+++ b/img/news/2026/reference.docx
@@ -4,10 +4,7 @@
   <w:body>
     <w:p>
       <w:r>
-        <w:t>Congratul</w:t>
-      </w:r>
-      <w:r>
-        <w:t>ations to Mr. Saurabh Sharma for successfully delivering his Open Seminar.</w:t>
+        <w:t>Congratulations to Mr. Saurabh Sharma for successfully delivering his Open Seminar.</w:t>
       </w:r>
     </w:p>
     <w:p>
@@ -606,7 +603,114 @@
         <w:t>Congratulations to Ms. Bhumika for successfully completing her comprehensive examination and SOTA seminar.</w:t>
       </w:r>
     </w:p>
-    <w:p/>
+    <w:p>
+      <w:r>
+        <w:rPr>
+          <w:noProof/>
+        </w:rPr>
+        <w:drawing>
+          <wp:inline distT="0" distB="0" distL="0" distR="0" wp14:anchorId="58F975A2" wp14:editId="2F5DAD6D">
+            <wp:extent cx="1249542" cy="2220190"/>
+            <wp:effectExtent l="0" t="0" r="8255" b="0"/>
+            <wp:docPr id="12" name="Picture 12"/>
+            <wp:cNvGraphicFramePr>
+              <a:graphicFrameLocks xmlns:a="http://schemas.openxmlformats.org/drawingml/2006/main" noChangeAspect="1"/>
+            </wp:cNvGraphicFramePr>
+            <a:graphic xmlns:a="http://schemas.openxmlformats.org/drawingml/2006/main">
+              <a:graphicData uri="http://schemas.openxmlformats.org/drawingml/2006/picture">
+                <pic:pic xmlns:pic="http://schemas.openxmlformats.org/drawingml/2006/picture">
+                  <pic:nvPicPr>
+                    <pic:cNvPr id="0" name="Picture 3"/>
+                    <pic:cNvPicPr>
+                      <a:picLocks noChangeAspect="1" noChangeArrowheads="1"/>
+                    </pic:cNvPicPr>
+                  </pic:nvPicPr>
+                  <pic:blipFill>
+                    <a:blip r:embed="rId10" cstate="print">
+                      <a:extLst>
+                        <a:ext uri="{28A0092B-C50C-407E-A947-70E740481C1C}">
+                          <a14:useLocalDpi xmlns:a14="http://schemas.microsoft.com/office/drawing/2010/main" val="0"/>
+                        </a:ext>
+                      </a:extLst>
+                    </a:blip>
+                    <a:srcRect/>
+                    <a:stretch>
+                      <a:fillRect/>
+                    </a:stretch>
+                  </pic:blipFill>
+                  <pic:spPr bwMode="auto">
+                    <a:xfrm>
+                      <a:off x="0" y="0"/>
+                      <a:ext cx="1257408" cy="2234167"/>
+                    </a:xfrm>
+                    <a:prstGeom prst="rect">
+                      <a:avLst/>
+                    </a:prstGeom>
+                    <a:noFill/>
+                    <a:ln>
+                      <a:noFill/>
+                    </a:ln>
+                  </pic:spPr>
+                </pic:pic>
+              </a:graphicData>
+            </a:graphic>
+          </wp:inline>
+        </w:drawing>
+      </w:r>
+      <w:r>
+        <w:rPr>
+          <w:noProof/>
+        </w:rPr>
+        <w:drawing>
+          <wp:inline distT="0" distB="0" distL="0" distR="0" wp14:anchorId="04206DE7" wp14:editId="745FBEA6">
+            <wp:extent cx="2913667" cy="1639873"/>
+            <wp:effectExtent l="0" t="0" r="1270" b="0"/>
+            <wp:docPr id="13" name="Picture 13"/>
+            <wp:cNvGraphicFramePr>
+              <a:graphicFrameLocks xmlns:a="http://schemas.openxmlformats.org/drawingml/2006/main" noChangeAspect="1"/>
+            </wp:cNvGraphicFramePr>
+            <a:graphic xmlns:a="http://schemas.openxmlformats.org/drawingml/2006/main">
+              <a:graphicData uri="http://schemas.openxmlformats.org/drawingml/2006/picture">
+                <pic:pic xmlns:pic="http://schemas.openxmlformats.org/drawingml/2006/picture">
+                  <pic:nvPicPr>
+                    <pic:cNvPr id="0" name="Picture 4"/>
+                    <pic:cNvPicPr>
+                      <a:picLocks noChangeAspect="1" noChangeArrowheads="1"/>
+                    </pic:cNvPicPr>
+                  </pic:nvPicPr>
+                  <pic:blipFill>
+                    <a:blip r:embed="rId11" cstate="print">
+                      <a:extLst>
+                        <a:ext uri="{28A0092B-C50C-407E-A947-70E740481C1C}">
+                          <a14:useLocalDpi xmlns:a14="http://schemas.microsoft.com/office/drawing/2010/main" val="0"/>
+                        </a:ext>
+                      </a:extLst>
+                    </a:blip>
+                    <a:srcRect/>
+                    <a:stretch>
+                      <a:fillRect/>
+                    </a:stretch>
+                  </pic:blipFill>
+                  <pic:spPr bwMode="auto">
+                    <a:xfrm>
+                      <a:off x="0" y="0"/>
+                      <a:ext cx="2927838" cy="1647848"/>
+                    </a:xfrm>
+                    <a:prstGeom prst="rect">
+                      <a:avLst/>
+                    </a:prstGeom>
+                    <a:noFill/>
+                    <a:ln>
+                      <a:noFill/>
+                    </a:ln>
+                  </pic:spPr>
+                </pic:pic>
+              </a:graphicData>
+            </a:graphic>
+          </wp:inline>
+        </w:drawing>
+      </w:r>
+    </w:p>
     <w:p/>
     <w:p/>
     <w:p>
@@ -621,13 +725,24 @@
       <w:r>
         <w:t xml:space="preserve"> for successfully completing her comprehensive examination.</w:t>
       </w:r>
-    </w:p>
-    <w:p/>
-    <w:p/>
-    <w:p/>
-    <w:p>
-      <w:r>
-        <w:lastRenderedPageBreak/>
+      <w:r>
+        <w:t xml:space="preserve"> (25</w:t>
+      </w:r>
+      <w:r>
+        <w:rPr>
+          <w:vertAlign w:val="superscript"/>
+        </w:rPr>
+        <w:t>th</w:t>
+      </w:r>
+      <w:r>
+        <w:t xml:space="preserve"> Aug 2026)</w:t>
+      </w:r>
+    </w:p>
+    <w:p/>
+    <w:p/>
+    <w:p/>
+    <w:p>
+      <w:r>
         <w:t xml:space="preserve">24th </w:t>
       </w:r>
       <w:r>
@@ -672,7 +787,7 @@
                     </pic:cNvPicPr>
                   </pic:nvPicPr>
                   <pic:blipFill rotWithShape="1">
-                    <a:blip r:embed="rId10">
+                    <a:blip r:embed="rId12">
                       <a:extLst>
                         <a:ext uri="{28A0092B-C50C-407E-A947-70E740481C1C}">
                           <a14:useLocalDpi xmlns:a14="http://schemas.microsoft.com/office/drawing/2010/main" val="0"/>
@@ -765,7 +880,7 @@
                     </pic:cNvPicPr>
                   </pic:nvPicPr>
                   <pic:blipFill rotWithShape="1">
-                    <a:blip r:embed="rId11">
+                    <a:blip r:embed="rId13">
                       <a:extLst>
                         <a:ext uri="{28A0092B-C50C-407E-A947-70E740481C1C}">
                           <a14:useLocalDpi xmlns:a14="http://schemas.microsoft.com/office/drawing/2010/main" val="0"/>
@@ -844,7 +959,7 @@
                     </pic:cNvPicPr>
                   </pic:nvPicPr>
                   <pic:blipFill rotWithShape="1">
-                    <a:blip r:embed="rId12" cstate="print">
+                    <a:blip r:embed="rId14" cstate="print">
                       <a:extLst>
                         <a:ext uri="{28A0092B-C50C-407E-A947-70E740481C1C}">
                           <a14:useLocalDpi xmlns:a14="http://schemas.microsoft.com/office/drawing/2010/main" val="0"/>

</xml_diff>

<commit_message>
Update publications, project dates, and the people and news counts.
Co-authored-by: Cursor <cursoragent@cursor.com>
</commit_message>
<xml_diff>
--- a/img/news/2026/reference.docx
+++ b/img/news/2026/reference.docx
@@ -75,27 +75,135 @@
     <w:p/>
     <w:p/>
     <w:p/>
-    <w:p>
-      <w:r>
+    <w:p/>
+    <w:p/>
+    <w:p/>
+    <w:p/>
+    <w:p/>
+    <w:p/>
+    <w:p/>
+    <w:p/>
+    <w:p/>
+    <w:p>
+      <w:r>
+        <w:lastRenderedPageBreak/>
         <w:t xml:space="preserve">Mr. Sandipan has attended the </w:t>
       </w:r>
       <w:r>
         <w:t>Si</w:t>
       </w:r>
       <w:r>
-        <w:t>ntering 2026 conference.</w:t>
-      </w:r>
-    </w:p>
-    <w:p/>
-    <w:p/>
-    <w:p/>
-    <w:p/>
-    <w:p/>
-    <w:p/>
-    <w:p/>
-    <w:p>
-      <w:r>
-        <w:lastRenderedPageBreak/>
+        <w:t>ntering 2026 conference</w:t>
+      </w:r>
+      <w:r>
+        <w:t xml:space="preserve"> (September)</w:t>
+      </w:r>
+      <w:r>
+        <w:t>.</w:t>
+      </w:r>
+    </w:p>
+    <w:p/>
+    <w:p>
+      <w:r>
+        <w:rPr>
+          <w:noProof/>
+        </w:rPr>
+        <w:drawing>
+          <wp:inline distT="0" distB="0" distL="0" distR="0" wp14:anchorId="6748BCF0" wp14:editId="3BED1C9F">
+            <wp:extent cx="3686175" cy="4914900"/>
+            <wp:effectExtent l="0" t="0" r="9525" b="0"/>
+            <wp:docPr id="5" name="Picture 5"/>
+            <wp:cNvGraphicFramePr>
+              <a:graphicFrameLocks xmlns:a="http://schemas.openxmlformats.org/drawingml/2006/main" noChangeAspect="1"/>
+            </wp:cNvGraphicFramePr>
+            <a:graphic xmlns:a="http://schemas.openxmlformats.org/drawingml/2006/main">
+              <a:graphicData uri="http://schemas.openxmlformats.org/drawingml/2006/picture">
+                <pic:pic xmlns:pic="http://schemas.openxmlformats.org/drawingml/2006/picture">
+                  <pic:nvPicPr>
+                    <pic:cNvPr id="5" name="Picture 5"/>
+                    <pic:cNvPicPr/>
+                  </pic:nvPicPr>
+                  <pic:blipFill>
+                    <a:blip r:embed="rId5" cstate="print">
+                      <a:extLst>
+                        <a:ext uri="{28A0092B-C50C-407E-A947-70E740481C1C}">
+                          <a14:useLocalDpi xmlns:a14="http://schemas.microsoft.com/office/drawing/2010/main" val="0"/>
+                        </a:ext>
+                      </a:extLst>
+                    </a:blip>
+                    <a:stretch>
+                      <a:fillRect/>
+                    </a:stretch>
+                  </pic:blipFill>
+                  <pic:spPr>
+                    <a:xfrm>
+                      <a:off x="0" y="0"/>
+                      <a:ext cx="3686175" cy="4914900"/>
+                    </a:xfrm>
+                    <a:prstGeom prst="rect">
+                      <a:avLst/>
+                    </a:prstGeom>
+                  </pic:spPr>
+                </pic:pic>
+              </a:graphicData>
+            </a:graphic>
+          </wp:inline>
+        </w:drawing>
+      </w:r>
+      <w:r>
+        <w:rPr>
+          <w:noProof/>
+        </w:rPr>
+        <w:drawing>
+          <wp:inline distT="0" distB="0" distL="0" distR="0" wp14:anchorId="409EE429" wp14:editId="167D0C9C">
+            <wp:extent cx="3566160" cy="2674620"/>
+            <wp:effectExtent l="0" t="0" r="0" b="0"/>
+            <wp:docPr id="10" name="Picture 10"/>
+            <wp:cNvGraphicFramePr>
+              <a:graphicFrameLocks xmlns:a="http://schemas.openxmlformats.org/drawingml/2006/main" noChangeAspect="1"/>
+            </wp:cNvGraphicFramePr>
+            <a:graphic xmlns:a="http://schemas.openxmlformats.org/drawingml/2006/main">
+              <a:graphicData uri="http://schemas.openxmlformats.org/drawingml/2006/picture">
+                <pic:pic xmlns:pic="http://schemas.openxmlformats.org/drawingml/2006/picture">
+                  <pic:nvPicPr>
+                    <pic:cNvPr id="10" name="Picture 10"/>
+                    <pic:cNvPicPr/>
+                  </pic:nvPicPr>
+                  <pic:blipFill>
+                    <a:blip r:embed="rId6" cstate="print">
+                      <a:extLst>
+                        <a:ext uri="{28A0092B-C50C-407E-A947-70E740481C1C}">
+                          <a14:useLocalDpi xmlns:a14="http://schemas.microsoft.com/office/drawing/2010/main" val="0"/>
+                        </a:ext>
+                      </a:extLst>
+                    </a:blip>
+                    <a:stretch>
+                      <a:fillRect/>
+                    </a:stretch>
+                  </pic:blipFill>
+                  <pic:spPr>
+                    <a:xfrm>
+                      <a:off x="0" y="0"/>
+                      <a:ext cx="3566160" cy="2674620"/>
+                    </a:xfrm>
+                    <a:prstGeom prst="rect">
+                      <a:avLst/>
+                    </a:prstGeom>
+                  </pic:spPr>
+                </pic:pic>
+              </a:graphicData>
+            </a:graphic>
+          </wp:inline>
+        </w:drawing>
+      </w:r>
+    </w:p>
+    <w:p/>
+    <w:p/>
+    <w:p/>
+    <w:p/>
+    <w:p/>
+    <w:p>
+      <w:r>
         <w:t xml:space="preserve">Congratulations to Mr. </w:t>
       </w:r>
       <w:proofErr w:type="spellStart"/>
@@ -113,6 +221,9 @@
       <w:proofErr w:type="spellEnd"/>
       <w:r>
         <w:t>. thesis, joining Exide Industries</w:t>
+      </w:r>
+      <w:r>
+        <w:t xml:space="preserve"> </w:t>
       </w:r>
     </w:p>
     <w:p>
@@ -138,7 +249,7 @@
                     </pic:cNvPicPr>
                   </pic:nvPicPr>
                   <pic:blipFill rotWithShape="1">
-                    <a:blip r:embed="rId5">
+                    <a:blip r:embed="rId7">
                       <a:extLst>
                         <a:ext uri="{28A0092B-C50C-407E-A947-70E740481C1C}">
                           <a14:useLocalDpi xmlns:a14="http://schemas.microsoft.com/office/drawing/2010/main" val="0"/>
@@ -223,7 +334,7 @@
                     </pic:cNvPicPr>
                   </pic:nvPicPr>
                   <pic:blipFill rotWithShape="1">
-                    <a:blip r:embed="rId6">
+                    <a:blip r:embed="rId8">
                       <a:extLst>
                         <a:ext uri="{28A0092B-C50C-407E-A947-70E740481C1C}">
                           <a14:useLocalDpi xmlns:a14="http://schemas.microsoft.com/office/drawing/2010/main" val="0"/>
@@ -271,7 +382,6 @@
     <w:p/>
     <w:p>
       <w:r>
-        <w:lastRenderedPageBreak/>
         <w:t xml:space="preserve">May to July 2026: </w:t>
       </w:r>
       <w:r>
@@ -336,7 +446,7 @@
                     </pic:cNvPicPr>
                   </pic:nvPicPr>
                   <pic:blipFill>
-                    <a:blip r:embed="rId7" cstate="print">
+                    <a:blip r:embed="rId9" cstate="print">
                       <a:extLst>
                         <a:ext uri="{28A0092B-C50C-407E-A947-70E740481C1C}">
                           <a14:useLocalDpi xmlns:a14="http://schemas.microsoft.com/office/drawing/2010/main" val="0"/>
@@ -389,7 +499,7 @@
                     </pic:cNvPicPr>
                   </pic:nvPicPr>
                   <pic:blipFill rotWithShape="1">
-                    <a:blip r:embed="rId8" cstate="print">
+                    <a:blip r:embed="rId10" cstate="print">
                       <a:extLst>
                         <a:ext uri="{28A0092B-C50C-407E-A947-70E740481C1C}">
                           <a14:useLocalDpi xmlns:a14="http://schemas.microsoft.com/office/drawing/2010/main" val="0"/>
@@ -529,7 +639,7 @@
                     </pic:cNvPicPr>
                   </pic:nvPicPr>
                   <pic:blipFill>
-                    <a:blip r:embed="rId9" cstate="print">
+                    <a:blip r:embed="rId11" cstate="print">
                       <a:extLst>
                         <a:ext uri="{28A0092B-C50C-407E-A947-70E740481C1C}">
                           <a14:useLocalDpi xmlns:a14="http://schemas.microsoft.com/office/drawing/2010/main" val="0"/>
@@ -608,6 +718,7 @@
         <w:rPr>
           <w:noProof/>
         </w:rPr>
+        <w:lastRenderedPageBreak/>
         <w:drawing>
           <wp:inline distT="0" distB="0" distL="0" distR="0" wp14:anchorId="58F975A2" wp14:editId="2F5DAD6D">
             <wp:extent cx="1249542" cy="2220190"/>
@@ -626,7 +737,7 @@
                     </pic:cNvPicPr>
                   </pic:nvPicPr>
                   <pic:blipFill>
-                    <a:blip r:embed="rId10" cstate="print">
+                    <a:blip r:embed="rId12" cstate="print">
                       <a:extLst>
                         <a:ext uri="{28A0092B-C50C-407E-A947-70E740481C1C}">
                           <a14:useLocalDpi xmlns:a14="http://schemas.microsoft.com/office/drawing/2010/main" val="0"/>
@@ -679,7 +790,7 @@
                     </pic:cNvPicPr>
                   </pic:nvPicPr>
                   <pic:blipFill>
-                    <a:blip r:embed="rId11" cstate="print">
+                    <a:blip r:embed="rId13" cstate="print">
                       <a:extLst>
                         <a:ext uri="{28A0092B-C50C-407E-A947-70E740481C1C}">
                           <a14:useLocalDpi xmlns:a14="http://schemas.microsoft.com/office/drawing/2010/main" val="0"/>
@@ -787,7 +898,7 @@
                     </pic:cNvPicPr>
                   </pic:nvPicPr>
                   <pic:blipFill rotWithShape="1">
-                    <a:blip r:embed="rId12">
+                    <a:blip r:embed="rId14">
                       <a:extLst>
                         <a:ext uri="{28A0092B-C50C-407E-A947-70E740481C1C}">
                           <a14:useLocalDpi xmlns:a14="http://schemas.microsoft.com/office/drawing/2010/main" val="0"/>
@@ -854,6 +965,7 @@
         <w:rPr>
           <w:noProof/>
         </w:rPr>
+        <w:lastRenderedPageBreak/>
         <w:drawing>
           <wp:anchor distT="0" distB="0" distL="114300" distR="114300" simplePos="0" relativeHeight="251662336" behindDoc="0" locked="0" layoutInCell="1" allowOverlap="1" wp14:anchorId="04ABD099" wp14:editId="4E6E30FB">
             <wp:simplePos x="0" y="0"/>
@@ -880,7 +992,7 @@
                     </pic:cNvPicPr>
                   </pic:nvPicPr>
                   <pic:blipFill rotWithShape="1">
-                    <a:blip r:embed="rId13">
+                    <a:blip r:embed="rId15">
                       <a:extLst>
                         <a:ext uri="{28A0092B-C50C-407E-A947-70E740481C1C}">
                           <a14:useLocalDpi xmlns:a14="http://schemas.microsoft.com/office/drawing/2010/main" val="0"/>
@@ -959,7 +1071,7 @@
                     </pic:cNvPicPr>
                   </pic:nvPicPr>
                   <pic:blipFill rotWithShape="1">
-                    <a:blip r:embed="rId14" cstate="print">
+                    <a:blip r:embed="rId16" cstate="print">
                       <a:extLst>
                         <a:ext uri="{28A0092B-C50C-407E-A947-70E740481C1C}">
                           <a14:useLocalDpi xmlns:a14="http://schemas.microsoft.com/office/drawing/2010/main" val="0"/>

</xml_diff>